<commit_message>
report update: datnt114 is at 1750.0 over 82 episodes (52W-30L, 63.4%) and beats the winner at every episode count from 15 onward, though its rating is 17 lower because it faces weaker opposition; it has not converged yet. Also record G_majkel (56296398) at 1451.7, which confirms the adaptive-source finding.
</commit_message>
<xml_diff>
--- a/Kaggriculture提升实验报告.docx
+++ b/Kaggriculture提升实验报告.docx
@@ -210,7 +210,7 @@
           <w:p>
             <w:r/>
             <w:r>
-              <w:t>后续 5 次新尝试</w:t>
+              <w:t>后续 6 次新尝试</w:t>
             </w:r>
           </w:p>
         </w:tc>
@@ -221,13 +221,22 @@
           <w:p>
             <w:r/>
             <w:r>
-              <w:t xml:space="preserve">1321.1 / 600.0 / 1515.8 / 1594.1 / 1718.1 —— </w:t>
+              <w:t xml:space="preserve">1321.1 / 600.0 / 1515.8 / 1594.1 / </w:t>
             </w:r>
             <w:r>
               <w:rPr>
                 <w:b/>
               </w:rPr>
-              <w:t>全部未超过 1767.3</w:t>
+              <w:t>1750.0</w:t>
+            </w:r>
+            <w:r>
+              <w:t xml:space="preserve"> / 1451.7 —— </w:t>
+            </w:r>
+            <w:r>
+              <w:rPr>
+                <w:b/>
+              </w:rPr>
+              <w:t>均未超过 1767.3，但 1750.0 已逼近且胜率更高</w:t>
             </w:r>
           </w:p>
         </w:tc>
@@ -4251,7 +4260,13 @@
           <w:p>
             <w:r/>
             <w:r>
-              <w:t>1718.1（峰值 1741.8）</w:t>
+              <w:rPr>
+                <w:b/>
+              </w:rPr>
+              <w:t>1750.0</w:t>
+            </w:r>
+            <w:r>
+              <w:t>（82 局 52胜30负）</w:t>
             </w:r>
           </w:p>
         </w:tc>
@@ -4262,7 +4277,85 @@
           <w:p>
             <w:r/>
             <w:r>
-              <w:t>未超赢家</w:t>
+              <w:rPr>
+                <w:b/>
+              </w:rPr>
+              <w:t>逼近赢家</w:t>
+            </w:r>
+            <w:r>
+              <w:t>：同局数下战绩全面更优（63.4% vs 54.8%），分数低 17 分系因对手更弱（均分 1655 vs 1734）；</w:t>
+            </w:r>
+            <w:r>
+              <w:rPr>
+                <w:b/>
+              </w:rPr>
+              <w:t>尚未收敛，可能反超</w:t>
+            </w:r>
+          </w:p>
+        </w:tc>
+      </w:tr>
+      <w:tr>
+        <w:tc>
+          <w:tcPr>
+            <w:tcW w:type="dxa" w:w="1728"/>
+          </w:tcPr>
+          <w:p>
+            <w:r/>
+            <w:r>
+              <w:t>56296398</w:t>
+            </w:r>
+          </w:p>
+        </w:tc>
+        <w:tc>
+          <w:tcPr>
+            <w:tcW w:type="dxa" w:w="1728"/>
+          </w:tcPr>
+          <w:p>
+            <w:r/>
+            <w:r>
+              <w:t>09-17 05:52</w:t>
+            </w:r>
+          </w:p>
+        </w:tc>
+        <w:tc>
+          <w:tcPr>
+            <w:tcW w:type="dxa" w:w="1728"/>
+          </w:tcPr>
+          <w:p>
+            <w:r/>
+            <w:r>
+              <w:t>Majkel1337 单表（3171 源）</w:t>
+            </w:r>
+          </w:p>
+        </w:tc>
+        <w:tc>
+          <w:tcPr>
+            <w:tcW w:type="dxa" w:w="1728"/>
+          </w:tcPr>
+          <w:p>
+            <w:r/>
+            <w:r>
+              <w:t>1451.7（60 局 33胜27负）</w:t>
+            </w:r>
+          </w:p>
+        </w:tc>
+        <w:tc>
+          <w:tcPr>
+            <w:tcW w:type="dxa" w:w="1728"/>
+          </w:tcPr>
+          <w:p>
+            <w:r/>
+            <w:r>
+              <w:t xml:space="preserve">✗ </w:t>
+            </w:r>
+            <w:r>
+              <w:rPr>
+                <w:b/>
+              </w:rPr>
+              <w:t>验证了第 4 节结论</w:t>
+            </w:r>
+            <w:r>
+              <w:t>：应变型选手的录像表移植失败</w:t>
             </w:r>
           </w:p>
         </w:tc>

</xml_diff>

<commit_message>
correct convergence methodology: judge by win rate WITHIN the rating band, not overall
Overall win rate is inflated by soft early matchups. Binning by opponent strength shows
E_datnt114 is already converged: 51.4% against 1700-2000 opponents (the 50% crossing point),
28.6% against 2000-2500. The winner crosses at the same place, 52.6%. Above 1700 the two
curves are statistically identical; they differ only below 1700 (datnt114 crushes weak
opponents harder, 80.8% vs 60.0%), which does not affect the ceiling.

So the earlier claim that datnt114 might still overtake 1767.3 was wrong, and this independently
confirms the ~1750 ceiling from two separate fixed-plan sources.

Bonus datum: against 2000-2500 opponents the banks are 85,752 vs 87,016 (a 1.5% gap) yet it
loses 71% of those games - the game is decided on a knife edge, which is why a 0.3% local
difference is meaningless and an 8.6-point win-rate gap is worth only 17 rating points.
</commit_message>
<xml_diff>
--- a/Kaggriculture提升实验报告.docx
+++ b/Kaggriculture提升实验报告.docx
@@ -236,7 +236,7 @@
               <w:rPr>
                 <w:b/>
               </w:rPr>
-              <w:t>均未超过 1767.3，但 1750.0 已逼近且胜率更高</w:t>
+              <w:t>均未超过 1767.3；其中 1750.0 与赢家在 1700 以上分段完全无法区分</w:t>
             </w:r>
           </w:p>
         </w:tc>
@@ -3729,7 +3729,1079 @@
           <w:b/>
           <w:i/>
         </w:rPr>
-        <w:t>我们的 1767.3 / 1718.1 已经贴着这个上限，换任何表都突破不了。</w:t>
+        <w:t>我们的 1767.3 / 1750.0 已经贴着这个上限，换任何表都突破不了。</w:t>
+      </w:r>
+    </w:p>
+    <w:p>
+      <w:pPr>
+        <w:pStyle w:val="Heading3"/>
+      </w:pPr>
+      <w:r>
+        <w:t>4.4 收敛的正确判据：分段胜率，而非总胜率</w:t>
+      </w:r>
+    </w:p>
+    <w:p>
+      <w:r>
+        <w:rPr>
+          <w:b/>
+        </w:rPr>
+        <w:t>总胜率会骗人</w:t>
+      </w:r>
+      <w:r>
+        <w:t xml:space="preserve"> —— 前期匹配到的都是弱对手，白送的胜利拉高了总胜率。</w:t>
+      </w:r>
+    </w:p>
+    <w:p>
+      <w:r>
+        <w:t>判断收敛应该看「</w:t>
+      </w:r>
+      <w:r>
+        <w:rPr>
+          <w:b/>
+        </w:rPr>
+        <w:t>在当前分段内胜率是否接近 50%</w:t>
+      </w:r>
+      <w:r>
+        <w:t>」。</w:t>
+      </w:r>
+    </w:p>
+    <w:p>
+      <w:r>
+        <w:t>按</w:t>
+      </w:r>
+      <w:r>
+        <w:rPr>
+          <w:b/>
+        </w:rPr>
+        <w:t>对手分数分段</w:t>
+      </w:r>
+      <w:r>
+        <w:t>统计（对手强度用其当前榜单分作代理）：</w:t>
+      </w:r>
+    </w:p>
+    <w:p>
+      <w:r>
+        <w:rPr>
+          <w:b/>
+        </w:rPr>
+        <w:t>E_datnt114（82 局，总胜率 63.4%）</w:t>
+      </w:r>
+    </w:p>
+    <w:tbl>
+      <w:tblPr>
+        <w:tblStyle w:val="LightGrid-Accent1"/>
+        <w:tblW w:type="auto" w:w="0"/>
+        <w:tblLook w:firstColumn="1" w:firstRow="1" w:lastColumn="0" w:lastRow="0" w:noHBand="0" w:noVBand="1" w:val="04A0"/>
+      </w:tblPr>
+      <w:tblGrid>
+        <w:gridCol w:w="1440"/>
+        <w:gridCol w:w="1440"/>
+        <w:gridCol w:w="1440"/>
+        <w:gridCol w:w="1440"/>
+        <w:gridCol w:w="1440"/>
+        <w:gridCol w:w="1440"/>
+      </w:tblGrid>
+      <w:tr>
+        <w:tc>
+          <w:tcPr>
+            <w:tcW w:type="dxa" w:w="1440"/>
+          </w:tcPr>
+          <w:p>
+            <w:r>
+              <w:rPr>
+                <w:b/>
+              </w:rPr>
+            </w:r>
+            <w:r>
+              <w:rPr>
+                <w:b/>
+              </w:rPr>
+              <w:t>对手分段</w:t>
+            </w:r>
+          </w:p>
+        </w:tc>
+        <w:tc>
+          <w:tcPr>
+            <w:tcW w:type="dxa" w:w="1440"/>
+          </w:tcPr>
+          <w:p>
+            <w:r>
+              <w:rPr>
+                <w:b/>
+              </w:rPr>
+            </w:r>
+            <w:r>
+              <w:rPr>
+                <w:b/>
+              </w:rPr>
+              <w:t>局数</w:t>
+            </w:r>
+          </w:p>
+        </w:tc>
+        <w:tc>
+          <w:tcPr>
+            <w:tcW w:type="dxa" w:w="1440"/>
+          </w:tcPr>
+          <w:p>
+            <w:r>
+              <w:rPr>
+                <w:b/>
+              </w:rPr>
+            </w:r>
+            <w:r>
+              <w:rPr>
+                <w:b/>
+              </w:rPr>
+              <w:t>战绩</w:t>
+            </w:r>
+          </w:p>
+        </w:tc>
+        <w:tc>
+          <w:tcPr>
+            <w:tcW w:type="dxa" w:w="1440"/>
+          </w:tcPr>
+          <w:p>
+            <w:r>
+              <w:rPr>
+                <w:b/>
+              </w:rPr>
+            </w:r>
+            <w:r>
+              <w:rPr>
+                <w:b/>
+              </w:rPr>
+              <w:t>胜率</w:t>
+            </w:r>
+          </w:p>
+        </w:tc>
+        <w:tc>
+          <w:tcPr>
+            <w:tcW w:type="dxa" w:w="1440"/>
+          </w:tcPr>
+          <w:p>
+            <w:r>
+              <w:rPr>
+                <w:b/>
+              </w:rPr>
+            </w:r>
+            <w:r>
+              <w:rPr>
+                <w:b/>
+              </w:rPr>
+              <w:t>我方资金</w:t>
+            </w:r>
+          </w:p>
+        </w:tc>
+        <w:tc>
+          <w:tcPr>
+            <w:tcW w:type="dxa" w:w="1440"/>
+          </w:tcPr>
+          <w:p>
+            <w:r>
+              <w:rPr>
+                <w:b/>
+              </w:rPr>
+            </w:r>
+            <w:r>
+              <w:rPr>
+                <w:b/>
+              </w:rPr>
+              <w:t>对方资金</w:t>
+            </w:r>
+          </w:p>
+        </w:tc>
+      </w:tr>
+      <w:tr>
+        <w:tc>
+          <w:tcPr>
+            <w:tcW w:type="dxa" w:w="1440"/>
+          </w:tcPr>
+          <w:p>
+            <w:r/>
+            <w:r>
+              <w:t>0–1000</w:t>
+            </w:r>
+          </w:p>
+        </w:tc>
+        <w:tc>
+          <w:tcPr>
+            <w:tcW w:type="dxa" w:w="1440"/>
+          </w:tcPr>
+          <w:p>
+            <w:r/>
+            <w:r>
+              <w:t>5</w:t>
+            </w:r>
+          </w:p>
+        </w:tc>
+        <w:tc>
+          <w:tcPr>
+            <w:tcW w:type="dxa" w:w="1440"/>
+          </w:tcPr>
+          <w:p>
+            <w:r/>
+            <w:r>
+              <w:t>5-0</w:t>
+            </w:r>
+          </w:p>
+        </w:tc>
+        <w:tc>
+          <w:tcPr>
+            <w:tcW w:type="dxa" w:w="1440"/>
+          </w:tcPr>
+          <w:p>
+            <w:r/>
+            <w:r>
+              <w:t>100%</w:t>
+            </w:r>
+          </w:p>
+        </w:tc>
+        <w:tc>
+          <w:tcPr>
+            <w:tcW w:type="dxa" w:w="1440"/>
+          </w:tcPr>
+          <w:p>
+            <w:r/>
+            <w:r>
+              <w:t>106,508</w:t>
+            </w:r>
+          </w:p>
+        </w:tc>
+        <w:tc>
+          <w:tcPr>
+            <w:tcW w:type="dxa" w:w="1440"/>
+          </w:tcPr>
+          <w:p>
+            <w:r/>
+            <w:r>
+              <w:t>51,892</w:t>
+            </w:r>
+          </w:p>
+        </w:tc>
+      </w:tr>
+      <w:tr>
+        <w:tc>
+          <w:tcPr>
+            <w:tcW w:type="dxa" w:w="1440"/>
+          </w:tcPr>
+          <w:p>
+            <w:r/>
+            <w:r>
+              <w:t>1000–1400</w:t>
+            </w:r>
+          </w:p>
+        </w:tc>
+        <w:tc>
+          <w:tcPr>
+            <w:tcW w:type="dxa" w:w="1440"/>
+          </w:tcPr>
+          <w:p>
+            <w:r/>
+            <w:r>
+              <w:t>4</w:t>
+            </w:r>
+          </w:p>
+        </w:tc>
+        <w:tc>
+          <w:tcPr>
+            <w:tcW w:type="dxa" w:w="1440"/>
+          </w:tcPr>
+          <w:p>
+            <w:r/>
+            <w:r>
+              <w:t>4-0</w:t>
+            </w:r>
+          </w:p>
+        </w:tc>
+        <w:tc>
+          <w:tcPr>
+            <w:tcW w:type="dxa" w:w="1440"/>
+          </w:tcPr>
+          <w:p>
+            <w:r/>
+            <w:r>
+              <w:t>100%</w:t>
+            </w:r>
+          </w:p>
+        </w:tc>
+        <w:tc>
+          <w:tcPr>
+            <w:tcW w:type="dxa" w:w="1440"/>
+          </w:tcPr>
+          <w:p>
+            <w:r/>
+            <w:r>
+              <w:t>76,473</w:t>
+            </w:r>
+          </w:p>
+        </w:tc>
+        <w:tc>
+          <w:tcPr>
+            <w:tcW w:type="dxa" w:w="1440"/>
+          </w:tcPr>
+          <w:p>
+            <w:r/>
+            <w:r>
+              <w:t>49,472</w:t>
+            </w:r>
+          </w:p>
+        </w:tc>
+      </w:tr>
+      <w:tr>
+        <w:tc>
+          <w:tcPr>
+            <w:tcW w:type="dxa" w:w="1440"/>
+          </w:tcPr>
+          <w:p>
+            <w:r/>
+            <w:r>
+              <w:t>1400–1700</w:t>
+            </w:r>
+          </w:p>
+        </w:tc>
+        <w:tc>
+          <w:tcPr>
+            <w:tcW w:type="dxa" w:w="1440"/>
+          </w:tcPr>
+          <w:p>
+            <w:r/>
+            <w:r>
+              <w:t>26</w:t>
+            </w:r>
+          </w:p>
+        </w:tc>
+        <w:tc>
+          <w:tcPr>
+            <w:tcW w:type="dxa" w:w="1440"/>
+          </w:tcPr>
+          <w:p>
+            <w:r/>
+            <w:r>
+              <w:t>21-5</w:t>
+            </w:r>
+          </w:p>
+        </w:tc>
+        <w:tc>
+          <w:tcPr>
+            <w:tcW w:type="dxa" w:w="1440"/>
+          </w:tcPr>
+          <w:p>
+            <w:r/>
+            <w:r>
+              <w:rPr>
+                <w:b/>
+              </w:rPr>
+              <w:t>80.8%</w:t>
+            </w:r>
+          </w:p>
+        </w:tc>
+        <w:tc>
+          <w:tcPr>
+            <w:tcW w:type="dxa" w:w="1440"/>
+          </w:tcPr>
+          <w:p>
+            <w:r/>
+            <w:r>
+              <w:t>98,666</w:t>
+            </w:r>
+          </w:p>
+        </w:tc>
+        <w:tc>
+          <w:tcPr>
+            <w:tcW w:type="dxa" w:w="1440"/>
+          </w:tcPr>
+          <w:p>
+            <w:r/>
+            <w:r>
+              <w:t>92,805</w:t>
+            </w:r>
+          </w:p>
+        </w:tc>
+      </w:tr>
+      <w:tr>
+        <w:tc>
+          <w:tcPr>
+            <w:tcW w:type="dxa" w:w="1440"/>
+          </w:tcPr>
+          <w:p>
+            <w:r/>
+            <w:r>
+              <w:rPr>
+                <w:b/>
+              </w:rPr>
+              <w:t>1700–2000</w:t>
+            </w:r>
+          </w:p>
+        </w:tc>
+        <w:tc>
+          <w:tcPr>
+            <w:tcW w:type="dxa" w:w="1440"/>
+          </w:tcPr>
+          <w:p>
+            <w:r/>
+            <w:r>
+              <w:t>35</w:t>
+            </w:r>
+          </w:p>
+        </w:tc>
+        <w:tc>
+          <w:tcPr>
+            <w:tcW w:type="dxa" w:w="1440"/>
+          </w:tcPr>
+          <w:p>
+            <w:r/>
+            <w:r>
+              <w:t>18-17</w:t>
+            </w:r>
+          </w:p>
+        </w:tc>
+        <w:tc>
+          <w:tcPr>
+            <w:tcW w:type="dxa" w:w="1440"/>
+          </w:tcPr>
+          <w:p>
+            <w:r/>
+            <w:r>
+              <w:rPr>
+                <w:b/>
+              </w:rPr>
+              <w:t>51.4%</w:t>
+            </w:r>
+            <w:r>
+              <w:t xml:space="preserve"> ← 50% 交汇点</w:t>
+            </w:r>
+          </w:p>
+        </w:tc>
+        <w:tc>
+          <w:tcPr>
+            <w:tcW w:type="dxa" w:w="1440"/>
+          </w:tcPr>
+          <w:p>
+            <w:r/>
+            <w:r>
+              <w:t>91,443</w:t>
+            </w:r>
+          </w:p>
+        </w:tc>
+        <w:tc>
+          <w:tcPr>
+            <w:tcW w:type="dxa" w:w="1440"/>
+          </w:tcPr>
+          <w:p>
+            <w:r/>
+            <w:r>
+              <w:t>90,602</w:t>
+            </w:r>
+          </w:p>
+        </w:tc>
+      </w:tr>
+      <w:tr>
+        <w:tc>
+          <w:tcPr>
+            <w:tcW w:type="dxa" w:w="1440"/>
+          </w:tcPr>
+          <w:p>
+            <w:r/>
+            <w:r>
+              <w:t>2000–2500</w:t>
+            </w:r>
+          </w:p>
+        </w:tc>
+        <w:tc>
+          <w:tcPr>
+            <w:tcW w:type="dxa" w:w="1440"/>
+          </w:tcPr>
+          <w:p>
+            <w:r/>
+            <w:r>
+              <w:t>7</w:t>
+            </w:r>
+          </w:p>
+        </w:tc>
+        <w:tc>
+          <w:tcPr>
+            <w:tcW w:type="dxa" w:w="1440"/>
+          </w:tcPr>
+          <w:p>
+            <w:r/>
+            <w:r>
+              <w:t>2-5</w:t>
+            </w:r>
+          </w:p>
+        </w:tc>
+        <w:tc>
+          <w:tcPr>
+            <w:tcW w:type="dxa" w:w="1440"/>
+          </w:tcPr>
+          <w:p>
+            <w:r/>
+            <w:r>
+              <w:rPr>
+                <w:b/>
+              </w:rPr>
+              <w:t>28.6%</w:t>
+            </w:r>
+          </w:p>
+        </w:tc>
+        <w:tc>
+          <w:tcPr>
+            <w:tcW w:type="dxa" w:w="1440"/>
+          </w:tcPr>
+          <w:p>
+            <w:r/>
+            <w:r>
+              <w:t>85,752</w:t>
+            </w:r>
+          </w:p>
+        </w:tc>
+        <w:tc>
+          <w:tcPr>
+            <w:tcW w:type="dxa" w:w="1440"/>
+          </w:tcPr>
+          <w:p>
+            <w:r/>
+            <w:r>
+              <w:t>87,016</w:t>
+            </w:r>
+          </w:p>
+        </w:tc>
+      </w:tr>
+      <w:tr>
+        <w:tc>
+          <w:tcPr>
+            <w:tcW w:type="dxa" w:w="1440"/>
+          </w:tcPr>
+          <w:p>
+            <w:r/>
+            <w:r>
+              <w:t>2500–3000</w:t>
+            </w:r>
+          </w:p>
+        </w:tc>
+        <w:tc>
+          <w:tcPr>
+            <w:tcW w:type="dxa" w:w="1440"/>
+          </w:tcPr>
+          <w:p>
+            <w:r/>
+            <w:r>
+              <w:t>5</w:t>
+            </w:r>
+          </w:p>
+        </w:tc>
+        <w:tc>
+          <w:tcPr>
+            <w:tcW w:type="dxa" w:w="1440"/>
+          </w:tcPr>
+          <w:p>
+            <w:r/>
+            <w:r>
+              <w:t>2-3</w:t>
+            </w:r>
+          </w:p>
+        </w:tc>
+        <w:tc>
+          <w:tcPr>
+            <w:tcW w:type="dxa" w:w="1440"/>
+          </w:tcPr>
+          <w:p>
+            <w:r/>
+            <w:r>
+              <w:t>40.0%</w:t>
+            </w:r>
+          </w:p>
+        </w:tc>
+        <w:tc>
+          <w:tcPr>
+            <w:tcW w:type="dxa" w:w="1440"/>
+          </w:tcPr>
+          <w:p>
+            <w:r/>
+            <w:r>
+              <w:t>91,892</w:t>
+            </w:r>
+          </w:p>
+        </w:tc>
+        <w:tc>
+          <w:tcPr>
+            <w:tcW w:type="dxa" w:w="1440"/>
+          </w:tcPr>
+          <w:p>
+            <w:r/>
+            <w:r>
+              <w:t>97,030</w:t>
+            </w:r>
+          </w:p>
+        </w:tc>
+      </w:tr>
+    </w:tbl>
+    <w:p/>
+    <w:p>
+      <w:r>
+        <w:rPr>
+          <w:b/>
+        </w:rPr>
+        <w:t>赢家（84 局，总胜率 54.8%）</w:t>
+      </w:r>
+    </w:p>
+    <w:tbl>
+      <w:tblPr>
+        <w:tblStyle w:val="LightGrid-Accent1"/>
+        <w:tblW w:type="auto" w:w="0"/>
+        <w:tblLook w:firstColumn="1" w:firstRow="1" w:lastColumn="0" w:lastRow="0" w:noHBand="0" w:noVBand="1" w:val="04A0"/>
+      </w:tblPr>
+      <w:tblGrid>
+        <w:gridCol w:w="2160"/>
+        <w:gridCol w:w="2160"/>
+        <w:gridCol w:w="2160"/>
+        <w:gridCol w:w="2160"/>
+      </w:tblGrid>
+      <w:tr>
+        <w:tc>
+          <w:tcPr>
+            <w:tcW w:type="dxa" w:w="2160"/>
+          </w:tcPr>
+          <w:p>
+            <w:r>
+              <w:rPr>
+                <w:b/>
+              </w:rPr>
+            </w:r>
+            <w:r>
+              <w:rPr>
+                <w:b/>
+              </w:rPr>
+              <w:t>对手分段</w:t>
+            </w:r>
+          </w:p>
+        </w:tc>
+        <w:tc>
+          <w:tcPr>
+            <w:tcW w:type="dxa" w:w="2160"/>
+          </w:tcPr>
+          <w:p>
+            <w:r>
+              <w:rPr>
+                <w:b/>
+              </w:rPr>
+            </w:r>
+            <w:r>
+              <w:rPr>
+                <w:b/>
+              </w:rPr>
+              <w:t>局数</w:t>
+            </w:r>
+          </w:p>
+        </w:tc>
+        <w:tc>
+          <w:tcPr>
+            <w:tcW w:type="dxa" w:w="2160"/>
+          </w:tcPr>
+          <w:p>
+            <w:r>
+              <w:rPr>
+                <w:b/>
+              </w:rPr>
+            </w:r>
+            <w:r>
+              <w:rPr>
+                <w:b/>
+              </w:rPr>
+              <w:t>战绩</w:t>
+            </w:r>
+          </w:p>
+        </w:tc>
+        <w:tc>
+          <w:tcPr>
+            <w:tcW w:type="dxa" w:w="2160"/>
+          </w:tcPr>
+          <w:p>
+            <w:r>
+              <w:rPr>
+                <w:b/>
+              </w:rPr>
+            </w:r>
+            <w:r>
+              <w:rPr>
+                <w:b/>
+              </w:rPr>
+              <w:t>胜率</w:t>
+            </w:r>
+          </w:p>
+        </w:tc>
+      </w:tr>
+      <w:tr>
+        <w:tc>
+          <w:tcPr>
+            <w:tcW w:type="dxa" w:w="2160"/>
+          </w:tcPr>
+          <w:p>
+            <w:r/>
+            <w:r>
+              <w:t>1400–1700</w:t>
+            </w:r>
+          </w:p>
+        </w:tc>
+        <w:tc>
+          <w:tcPr>
+            <w:tcW w:type="dxa" w:w="2160"/>
+          </w:tcPr>
+          <w:p>
+            <w:r/>
+            <w:r>
+              <w:t>20</w:t>
+            </w:r>
+          </w:p>
+        </w:tc>
+        <w:tc>
+          <w:tcPr>
+            <w:tcW w:type="dxa" w:w="2160"/>
+          </w:tcPr>
+          <w:p>
+            <w:r/>
+            <w:r>
+              <w:t>12-8</w:t>
+            </w:r>
+          </w:p>
+        </w:tc>
+        <w:tc>
+          <w:tcPr>
+            <w:tcW w:type="dxa" w:w="2160"/>
+          </w:tcPr>
+          <w:p>
+            <w:r/>
+            <w:r>
+              <w:t>60.0%</w:t>
+            </w:r>
+          </w:p>
+        </w:tc>
+      </w:tr>
+      <w:tr>
+        <w:tc>
+          <w:tcPr>
+            <w:tcW w:type="dxa" w:w="2160"/>
+          </w:tcPr>
+          <w:p>
+            <w:r/>
+            <w:r>
+              <w:rPr>
+                <w:b/>
+              </w:rPr>
+              <w:t>1700–2000</w:t>
+            </w:r>
+          </w:p>
+        </w:tc>
+        <w:tc>
+          <w:tcPr>
+            <w:tcW w:type="dxa" w:w="2160"/>
+          </w:tcPr>
+          <w:p>
+            <w:r/>
+            <w:r>
+              <w:t>38</w:t>
+            </w:r>
+          </w:p>
+        </w:tc>
+        <w:tc>
+          <w:tcPr>
+            <w:tcW w:type="dxa" w:w="2160"/>
+          </w:tcPr>
+          <w:p>
+            <w:r/>
+            <w:r>
+              <w:t>20-18</w:t>
+            </w:r>
+          </w:p>
+        </w:tc>
+        <w:tc>
+          <w:tcPr>
+            <w:tcW w:type="dxa" w:w="2160"/>
+          </w:tcPr>
+          <w:p>
+            <w:r/>
+            <w:r>
+              <w:rPr>
+                <w:b/>
+              </w:rPr>
+              <w:t>52.6%</w:t>
+            </w:r>
+            <w:r>
+              <w:t xml:space="preserve"> ← 50% 交汇点</w:t>
+            </w:r>
+          </w:p>
+        </w:tc>
+      </w:tr>
+      <w:tr>
+        <w:tc>
+          <w:tcPr>
+            <w:tcW w:type="dxa" w:w="2160"/>
+          </w:tcPr>
+          <w:p>
+            <w:r/>
+            <w:r>
+              <w:t>2000–2500</w:t>
+            </w:r>
+          </w:p>
+        </w:tc>
+        <w:tc>
+          <w:tcPr>
+            <w:tcW w:type="dxa" w:w="2160"/>
+          </w:tcPr>
+          <w:p>
+            <w:r/>
+            <w:r>
+              <w:t>11</w:t>
+            </w:r>
+          </w:p>
+        </w:tc>
+        <w:tc>
+          <w:tcPr>
+            <w:tcW w:type="dxa" w:w="2160"/>
+          </w:tcPr>
+          <w:p>
+            <w:r/>
+            <w:r>
+              <w:t>3-8</w:t>
+            </w:r>
+          </w:p>
+        </w:tc>
+        <w:tc>
+          <w:tcPr>
+            <w:tcW w:type="dxa" w:w="2160"/>
+          </w:tcPr>
+          <w:p>
+            <w:r/>
+            <w:r>
+              <w:rPr>
+                <w:b/>
+              </w:rPr>
+              <w:t>27.3%</w:t>
+            </w:r>
+          </w:p>
+        </w:tc>
+      </w:tr>
+      <w:tr>
+        <w:tc>
+          <w:tcPr>
+            <w:tcW w:type="dxa" w:w="2160"/>
+          </w:tcPr>
+          <w:p>
+            <w:r/>
+            <w:r>
+              <w:t>2500–3000</w:t>
+            </w:r>
+          </w:p>
+        </w:tc>
+        <w:tc>
+          <w:tcPr>
+            <w:tcW w:type="dxa" w:w="2160"/>
+          </w:tcPr>
+          <w:p>
+            <w:r/>
+            <w:r>
+              <w:t>7</w:t>
+            </w:r>
+          </w:p>
+        </w:tc>
+        <w:tc>
+          <w:tcPr>
+            <w:tcW w:type="dxa" w:w="2160"/>
+          </w:tcPr>
+          <w:p>
+            <w:r/>
+            <w:r>
+              <w:t>3-4</w:t>
+            </w:r>
+          </w:p>
+        </w:tc>
+        <w:tc>
+          <w:tcPr>
+            <w:tcW w:type="dxa" w:w="2160"/>
+          </w:tcPr>
+          <w:p>
+            <w:r/>
+            <w:r>
+              <w:t>42.9%</w:t>
+            </w:r>
+          </w:p>
+        </w:tc>
+      </w:tr>
+    </w:tbl>
+    <w:p/>
+    <w:p>
+      <w:r>
+        <w:rPr>
+          <w:b/>
+        </w:rPr>
+        <w:t>两条重要结论：</w:t>
+      </w:r>
+    </w:p>
+    <w:p>
+      <w:pPr>
+        <w:pStyle w:val="ListNumber"/>
+      </w:pPr>
+      <w:r>
+        <w:rPr>
+          <w:b/>
+        </w:rPr>
+        <w:t>datnt114 已经收敛</w:t>
+      </w:r>
+      <w:r>
+        <w:t>（1700–2000 分段 51.4%），</w:t>
+      </w:r>
+      <w:r>
+        <w:rPr>
+          <w:b/>
+        </w:rPr>
+        <w:t>不是「还在爬」</w:t>
+      </w:r>
+      <w:r>
+        <w:t>。</w:t>
+      </w:r>
+    </w:p>
+    <w:p>
+      <w:r>
+        <w:t xml:space="preserve">   用总胜率 63.4% 推断它未收敛是</w:t>
+      </w:r>
+      <w:r>
+        <w:rPr>
+          <w:b/>
+        </w:rPr>
+        <w:t>错误</w:t>
+      </w:r>
+      <w:r>
+        <w:t>的 —— 总胜率被前期虐菜局拉高了。</w:t>
+      </w:r>
+    </w:p>
+    <w:p>
+      <w:pPr>
+        <w:pStyle w:val="ListNumber"/>
+      </w:pPr>
+      <w:r>
+        <w:rPr>
+          <w:b/>
+        </w:rPr>
+        <w:t>两个 agent 在 1700 以上的曲线几乎重合</w:t>
+      </w:r>
+      <w:r>
+        <w:t>：</w:t>
+      </w:r>
+    </w:p>
+    <w:p>
+      <w:r>
+        <w:t xml:space="preserve">   | 对手分段 | datnt114 | 赢家 | 差异 |</w:t>
+      </w:r>
+    </w:p>
+    <w:p>
+      <w:r>
+        <w:t xml:space="preserve">   |---|---|---|---|</w:t>
+      </w:r>
+    </w:p>
+    <w:p>
+      <w:r>
+        <w:t xml:space="preserve">   | 1700–2000 | 51.4% | 52.6% | 1.2%（噪声） |</w:t>
+      </w:r>
+    </w:p>
+    <w:p>
+      <w:r>
+        <w:t xml:space="preserve">   | 2000–2500 | 28.6% | 27.3% | 1.3%（噪声） |</w:t>
+      </w:r>
+    </w:p>
+    <w:p>
+      <w:r>
+        <w:t xml:space="preserve">   | 2500–3000 | 40.0% | 42.9% | 2.9%（噪声） |</w:t>
+      </w:r>
+    </w:p>
+    <w:p>
+      <w:r>
+        <w:t xml:space="preserve">   唯一差别在 1700 以下（datnt114 虐菜更狠：80.8% vs 60.0%），</w:t>
+      </w:r>
+      <w:r>
+        <w:rPr>
+          <w:b/>
+        </w:rPr>
+        <w:t>而这不影响终值</w:t>
+      </w:r>
+      <w:r>
+        <w:t>。</w:t>
+      </w:r>
+    </w:p>
+    <w:p>
+      <w:r>
+        <w:t xml:space="preserve">   → </w:t>
+      </w:r>
+      <w:r>
+        <w:rPr>
+          <w:b/>
+        </w:rPr>
+        <w:t>两个独立的固定计划型源收敛到同一高度。这是对 4.3 节天花板结论的强力印证。</w:t>
+      </w:r>
+    </w:p>
+    <w:p>
+      <w:pPr>
+        <w:pStyle w:val="ListNumber"/>
+      </w:pPr>
+      <w:r>
+        <w:rPr>
+          <w:b/>
+        </w:rPr>
+        <w:t>这游戏是刀锋上的胜负</w:t>
+      </w:r>
+      <w:r>
+        <w:t xml:space="preserve">：对手 2000–2500 时，双方资金 </w:t>
+      </w:r>
+      <w:r>
+        <w:rPr>
+          <w:b/>
+        </w:rPr>
+        <w:t>85,752 : 87,016</w:t>
+      </w:r>
+      <w:r>
+        <w:t>，</w:t>
+      </w:r>
+    </w:p>
+    <w:p>
+      <w:r>
+        <w:t xml:space="preserve">   只差 </w:t>
+      </w:r>
+      <w:r>
+        <w:rPr>
+          <w:b/>
+        </w:rPr>
+        <w:t>1.5%</w:t>
+      </w:r>
+      <w:r>
+        <w:t xml:space="preserve">，却输掉 </w:t>
+      </w:r>
+      <w:r>
+        <w:rPr>
+          <w:b/>
+        </w:rPr>
+        <w:t>71%</w:t>
+      </w:r>
+      <w:r>
+        <w:t xml:space="preserve"> 的对局。</w:t>
+      </w:r>
+      <w:r>
+        <w:rPr>
+          <w:b/>
+        </w:rPr>
+        <w:t>产出差 1.5% ≈ 败率 71%。</w:t>
+      </w:r>
+    </w:p>
+    <w:p>
+      <w:r>
+        <w:t xml:space="preserve">   → 因此任何「提升几个百分点产出」的改动，都可能带来巨大的胜率变化；</w:t>
+      </w:r>
+    </w:p>
+    <w:p>
+      <w:r>
+        <w:t xml:space="preserve">     反过来，任何看起来很小的退化也会致命。这解释了为什么本地评测的</w:t>
+      </w:r>
+    </w:p>
+    <w:p>
+      <w:r>
+        <w:t xml:space="preserve">     微小差异（0.3%）没有意义，而 8.6 个百分点的胜率差只对应 17 分。</w:t>
       </w:r>
     </w:p>
     <w:p>
@@ -4280,16 +5352,10 @@
               <w:rPr>
                 <w:b/>
               </w:rPr>
-              <w:t>逼近赢家</w:t>
-            </w:r>
-            <w:r>
-              <w:t>：同局数下战绩全面更优（63.4% vs 54.8%），分数低 17 分系因对手更弱（均分 1655 vs 1734）；</w:t>
-            </w:r>
-            <w:r>
-              <w:rPr>
-                <w:b/>
-              </w:rPr>
-              <w:t>尚未收敛，可能反超</w:t>
+              <w:t>与赢家实质等同</w:t>
+            </w:r>
+            <w:r>
+              <w:t>：1700–2000 分段胜率 51.4% vs 52.6%（已收敛）；1700 以上曲线重合，差别只在虐菜（见 4.4 节）</w:t>
             </w:r>
           </w:p>
         </w:tc>

</xml_diff>